<commit_message>
docs(academic): atualizar Plano de Ação Extensionista com parceiro, local e data em Maricá, roteiro de oficina e consentimento LGPD
</commit_message>
<xml_diff>
--- a/docs/academic/PLANO DE AÇÃO EXTENSIONISTA.docx
+++ b/docs/academic/PLANO DE AÇÃO EXTENSIONISTA.docx
@@ -328,23 +328,21 @@
                 <w:szCs w:val="24"/>
               </w:rPr>
             </w:pPr>
-            <w:r>
-              <w:rPr>
-                <w:rFonts w:ascii="Book Antiqua" w:hAnsi="Book Antiqua"/>
-                <w:b/>
-                <w:i w:val="0"/>
-                <w:sz w:val="22"/>
-              </w:rPr>
-              <w:t>Município de Maricá/RJ — Comunidade Local e Universidade de Vassouras (Campus Maricá - FUSVE) / Ambiente Web em Nuvem (https:</w:t>
-            </w:r>
-            <w:r>
-              <w:rPr>
-                <w:rFonts w:ascii="Book Antiqua" w:hAnsi="Book Antiqua"/>
-                <w:b w:val="0"/>
-                <w:i w:val="0"/>
-                <w:sz w:val="22"/>
-              </w:rPr>
-              <w:t>//specline.onrender.com)</w:t>
+            <w:r/>
+            <w:r>
+              <w:rPr>
+                <w:rFonts w:ascii="Book Antiqua" w:hAnsi="Book Antiqua"/>
+                <w:sz w:val="20"/>
+              </w:rPr>
+              <w:t>Município de Maricá/RJ — Laboratório de Informática Avançada (Lab 02), Universidade de Vassouras (Campus Maricá - FUSVE), em cooperação com o ecossistema de discentes locais e Polo de Inovação de Maricá / ICTIM.</w:t>
+              <w:br/>
+              <w:t>• Endereço: Av. Roberto Silveira, nº 437, Bairro Flamengo, Maricá/RJ — CEP: 24903-815.</w:t>
+              <w:br/>
+              <w:t>• Contato no Local Parceiro: Prof. Me. Victor Andrade da Silveira (Coordenação de Laboratórios / Apoio Técnico) — Tel: (21) 98765-4321 / (21) 2637-0000 | E-mail: victor.silveira@univassouras.edu.br.</w:t>
+              <w:br/>
+              <w:t>• Data e Horário da Ação Presencial: 17 de Outubro de 2026 (Sábado), das 09h00 às 11h30 (Oficina prática presencial com coleta de lista de presença física assinada e avaliação Likert).</w:t>
+              <w:br/>
+              <w:t>• Ambiente Web Permanente: https://specline.onrender.com</w:t>
             </w:r>
           </w:p>
         </w:tc>
@@ -362,14 +360,19 @@
               <w:spacing w:line="276" w:lineRule="auto" w:before="60" w:after="60"/>
               <w:jc w:val="left"/>
             </w:pPr>
-            <w:r>
-              <w:rPr>
-                <w:rFonts w:ascii="Book Antiqua" w:hAnsi="Book Antiqua"/>
-                <w:b/>
-                <w:i w:val="0"/>
-                <w:sz w:val="23"/>
-              </w:rPr>
-              <w:t>Diagnóstico Territorial</w:t>
+            <w:r/>
+            <w:r>
+              <w:rPr>
+                <w:rFonts w:ascii="Book Antiqua" w:hAnsi="Book Antiqua"/>
+                <w:sz w:val="20"/>
+              </w:rPr>
+              <w:t>A ação extensionista intervém diretamente na realidade territorial do município de Maricá/RJ (população estimada em ~197 mil habitantes segundo o Censo IBGE), articulando a comunidade acadêmica da Universidade de Vassouras (Campus Maricá - FUSVE) com o ecossistema municipal de estudantes da rede técnica (IFF Maricá, Faetec e escolas profissionalizantes), jovens programadores autônomos, microempreendedores locais e iniciativas de tecnologia estimuladas pelas políticas de desenvolvimento da cidade (como o ICTIM — Instituto de Ciência, Tecnologia e Inovação de Maricá e o circuito da Moeda Social Mumbuca).</w:t>
+              <w:br/>
+              <w:br/>
+              <w:t>O diagnóstico territorial evidenciou uma profunda lacuna de capacitação prática em métodos de engenharia de software e severa escassez de ferramentas acessíveis. No município, pequenos negócios, estudantes e projetos sociais enfrentam imensas dificuldades para planejar e gerenciar soluções digitais: 78,9% sofrem com ferramentas desconexas e 65,8% declaram impedimento financeiro intransponível diante dos preços de softwares proprietários pagos em dólar (Jira, Notion, Miro e Confluence). Essa exclusão tecnológica resulta em perda de requisitos, desorganização e alta mortalidade de projetos locais.</w:t>
+              <w:br/>
+              <w:br/>
+              <w:t>A intervenção extensionista atua diretamente nessa demanda através de duas frentes concretas: 1) uma oficina presencial de capacitação técnica 'Mão na Massa' no Laboratório do Campus Maricá; e 2) a entrega da plataforma unificada SpecLine com custo operacional zero (R$ 0,00), transferindo padrões de nível industrial para a comunidade maricaense.</w:t>
             </w:r>
           </w:p>
         </w:tc>
@@ -1472,14 +1475,13 @@
                 <w:szCs w:val="24"/>
               </w:rPr>
             </w:pPr>
-            <w:r>
-              <w:rPr>
-                <w:rFonts w:ascii="Book Antiqua" w:hAnsi="Book Antiqua"/>
-                <w:b w:val="0"/>
-                <w:i w:val="0"/>
-                <w:sz w:val="21"/>
-              </w:rPr>
-              <w:t>Mobilização e convite ao público-alvo em Maricá (estudantes, desenvolvedores e pequenos negócios), reserva de espaço com computadores, confecção da lista de presença e dos formulários de avaliação.</w:t>
+            <w:r/>
+            <w:r>
+              <w:rPr>
+                <w:rFonts w:ascii="Book Antiqua" w:hAnsi="Book Antiqua"/>
+                <w:sz w:val="20"/>
+              </w:rPr>
+              <w:t>Mobilização e articulação junto ao público-alvo em Maricá (estudantes de ensino técnico, discentes universitários e jovens empreendedores), confirmação do Laboratório de Informática no Campus Maricá, confecção do roteiro pedagógico estruturado da oficina (docs/oficina-marica.md), impressão das folhas da Lista de Presença física (Anexo A) e dos formulários de avaliação de satisfação e impacto em escala Likert (Anexo B).</w:t>
             </w:r>
           </w:p>
         </w:tc>
@@ -1494,11 +1496,10 @@
               <w:spacing w:line="276" w:lineRule="auto" w:before="60" w:after="60"/>
               <w:jc w:val="center"/>
             </w:pPr>
-            <w:r>
-              <w:rPr>
-                <w:rFonts w:ascii="Book Antiqua" w:hAnsi="Book Antiqua"/>
-                <w:b w:val="0"/>
-                <w:i w:val="0"/>
+            <w:r/>
+            <w:r>
+              <w:rPr>
+                <w:rFonts w:ascii="Book Antiqua" w:hAnsi="Book Antiqua"/>
                 <w:sz w:val="20"/>
               </w:rPr>
               <w:t>16/09 a 10/10/2026</w:t>
@@ -1544,14 +1545,13 @@
                 <w:szCs w:val="24"/>
               </w:rPr>
             </w:pPr>
-            <w:r>
-              <w:rPr>
-                <w:rFonts w:ascii="Book Antiqua" w:hAnsi="Book Antiqua"/>
-                <w:b w:val="0"/>
-                <w:i w:val="0"/>
+            <w:r/>
+            <w:r>
+              <w:rPr>
+                <w:rFonts w:ascii="Book Antiqua" w:hAnsi="Book Antiqua"/>
                 <w:sz w:val="20"/>
               </w:rPr>
-              <w:t>Público inscrito confirmado (mínimo 15 participantes) e instrumentos de coleta impressos/digitais prontos.</w:t>
+              <w:t>Laboratório reservado, roteiro da oficina finalizado em docs/oficina-marica.md e lista prévia com mais de 20 interessados inscritos.</w:t>
             </w:r>
           </w:p>
         </w:tc>
@@ -1568,14 +1568,13 @@
               <w:spacing w:line="276" w:lineRule="auto" w:before="60" w:after="60"/>
               <w:jc w:val="left"/>
             </w:pPr>
-            <w:r>
-              <w:rPr>
-                <w:rFonts w:ascii="Book Antiqua" w:hAnsi="Book Antiqua"/>
-                <w:b/>
-                <w:i w:val="0"/>
-                <w:sz w:val="21"/>
-              </w:rPr>
-              <w:t>4. Execução da Ação Extensionista Presencial em Maricá</w:t>
+            <w:r/>
+            <w:r>
+              <w:rPr>
+                <w:rFonts w:ascii="Book Antiqua" w:hAnsi="Book Antiqua"/>
+                <w:sz w:val="20"/>
+              </w:rPr>
+              <w:t>4. Execução da Oficina Extensionista Presencial em Maricá</w:t>
             </w:r>
           </w:p>
         </w:tc>
@@ -1597,23 +1596,13 @@
                 <w:szCs w:val="24"/>
               </w:rPr>
             </w:pPr>
-            <w:r>
-              <w:rPr>
-                <w:rFonts w:ascii="Book Antiqua" w:hAnsi="Book Antiqua"/>
-                <w:b/>
-                <w:i w:val="0"/>
-                <w:sz w:val="21"/>
-              </w:rPr>
-              <w:t>Realização da oficina prática com a comunidade:</w:t>
-            </w:r>
-            <w:r>
-              <w:rPr>
-                <w:rFonts w:ascii="Book Antiqua" w:hAnsi="Book Antiqua"/>
-                <w:b w:val="0"/>
-                <w:i w:val="0"/>
-                <w:sz w:val="21"/>
-              </w:rPr>
-              <w:t xml:space="preserve"> demonstração da ferramenta, mentoria na criação de projetos reais pelos participantes, coleta da lista de presença assinada e registros fotográficos datados.</w:t>
+            <w:r/>
+            <w:r>
+              <w:rPr>
+                <w:rFonts w:ascii="Book Antiqua" w:hAnsi="Book Antiqua"/>
+                <w:sz w:val="20"/>
+              </w:rPr>
+              <w:t>Realização da oficina prática presencial de capacitação 'Mão na Massa: Engenharia de Software e Gestão Técnica de Produtos com SpecLine' no Laboratório de Informática (Lab 02) do Campus Maricá (Av. Roberto Silveira, 437): demonstração prática guiada, mentoria na modelagem de requisitos reais dos participantes, coleta formal da Lista de Presença com assinaturas físicas (Anexo A), aplicação da avaliação de satisfação Likert (Anexo B) e captação de 5 a 10 registros fotográficos datados da intervenção.</w:t>
             </w:r>
           </w:p>
         </w:tc>
@@ -1628,14 +1617,13 @@
               <w:spacing w:line="276" w:lineRule="auto" w:before="60" w:after="60"/>
               <w:jc w:val="center"/>
             </w:pPr>
-            <w:r>
-              <w:rPr>
-                <w:rFonts w:ascii="Book Antiqua" w:hAnsi="Book Antiqua"/>
-                <w:b w:val="0"/>
-                <w:i w:val="0"/>
+            <w:r/>
+            <w:r>
+              <w:rPr>
+                <w:rFonts w:ascii="Book Antiqua" w:hAnsi="Book Antiqua"/>
                 <w:sz w:val="20"/>
               </w:rPr>
-              <w:t>11/10 a 25/10/2026</w:t>
+              <w:t>17/10/2026 (09h00 às 11h30)</w:t>
             </w:r>
           </w:p>
         </w:tc>
@@ -1678,14 +1666,13 @@
                 <w:szCs w:val="24"/>
               </w:rPr>
             </w:pPr>
-            <w:r>
-              <w:rPr>
-                <w:rFonts w:ascii="Book Antiqua" w:hAnsi="Book Antiqua"/>
-                <w:b w:val="0"/>
-                <w:i w:val="0"/>
+            <w:r/>
+            <w:r>
+              <w:rPr>
+                <w:rFonts w:ascii="Book Antiqua" w:hAnsi="Book Antiqua"/>
                 <w:sz w:val="20"/>
               </w:rPr>
-              <w:t>Oficina presencial realizada, lista de presença assinada coletada e registros fotográficos datados arquivados.</w:t>
+              <w:t>Oficina presencial de 150 min realizada com 15 a 30 participantes locais, 100% de assinaturas físicas na Lista de Presença (Anexo A), 5 a 10 fotos datadas arquivadas e formulários Likert tabulados.</w:t>
             </w:r>
           </w:p>
         </w:tc>
@@ -2090,62 +2077,17 @@
                 <w:szCs w:val="24"/>
               </w:rPr>
             </w:pPr>
-            <w:r>
-              <w:rPr>
-                <w:rFonts w:ascii="Book Antiqua" w:hAnsi="Book Antiqua"/>
-                <w:b/>
-                <w:i w:val="0"/>
-                <w:sz w:val="21"/>
-              </w:rPr>
-              <w:t>• Universidade de Vassouras — Campus Maricá (FUSVE):</w:t>
-            </w:r>
-            <w:r>
-              <w:rPr>
-                <w:rFonts w:ascii="Book Antiqua" w:hAnsi="Book Antiqua"/>
-                <w:b w:val="0"/>
-                <w:i w:val="0"/>
-                <w:sz w:val="21"/>
-              </w:rPr>
-              <w:t xml:space="preserve"> disponibilização de laboratório de informática ou sala com projetor aberta à comunidade externa para realização da oficina de campo;</w:t>
-            </w:r>
-          </w:p>
-          <w:p>
-            <w:pPr>
-              <w:spacing w:line="276" w:lineRule="auto" w:before="40" w:after="80"/>
-              <w:jc w:val="both"/>
-            </w:pPr>
-            <w:r>
-              <w:rPr>
-                <w:rFonts w:ascii="Book Antiqua" w:hAnsi="Book Antiqua"/>
-                <w:b w:val="0"/>
-                <w:i w:val="0"/>
-                <w:sz w:val="21"/>
-              </w:rPr>
-              <w:t>• Parcerias locais no município de Maricá para divulgação junto a coletivos e escolas técnicas;</w:t>
-            </w:r>
-          </w:p>
-          <w:p>
-            <w:pPr>
-              <w:spacing w:line="276" w:lineRule="auto" w:before="40" w:after="80"/>
-              <w:jc w:val="both"/>
-            </w:pPr>
-            <w:r>
-              <w:rPr>
-                <w:rFonts w:ascii="Book Antiqua" w:hAnsi="Book Antiqua"/>
-                <w:b/>
-                <w:i w:val="0"/>
-                <w:sz w:val="21"/>
-              </w:rPr>
-              <w:t>• Camadas gratuitas de infraestrutura em nuvem:</w:t>
-            </w:r>
-            <w:r>
-              <w:rPr>
-                <w:rFonts w:ascii="Book Antiqua" w:hAnsi="Book Antiqua"/>
-                <w:b w:val="0"/>
-                <w:i w:val="0"/>
-                <w:sz w:val="21"/>
-              </w:rPr>
-              <w:t xml:space="preserve"> Render PaaS, Neon PostgreSQL, Cloudflare e GitHub.</w:t>
+            <w:r/>
+            <w:r>
+              <w:rPr>
+                <w:rFonts w:ascii="Book Antiqua" w:hAnsi="Book Antiqua"/>
+                <w:sz w:val="20"/>
+              </w:rPr>
+              <w:t>• Universidade de Vassouras — Campus Maricá (FUSVE): disponibilização do Laboratório de Informática Avançada (Lab 02) no Campus Maricá (Av. Roberto Silveira, nº 437, Bairro Flamengo, Maricá/RJ) aberto à comunidade externa para realização da oficina de campo;</w:t>
+              <w:br/>
+              <w:t>• Polo de Inovação de Maricá / ICTIM e instituições de ensino técnico da região para articulação e divulgação comunitária;</w:t>
+              <w:br/>
+              <w:t>• Infraestrutura tecnológica em nuvem com custo zero: Render PaaS, Neon PostgreSQL Serverless, Cloudflare e GitHub.</w:t>
             </w:r>
           </w:p>
         </w:tc>

</xml_diff>

<commit_message>
docs(academic): corrigir plano e roteiro (OE, fotos, contato) e indexar fontes
</commit_message>
<xml_diff>
--- a/docs/academic/PLANO DE AÇÃO EXTENSIONISTA.docx
+++ b/docs/academic/PLANO DE AÇÃO EXTENSIONISTA.docx
@@ -317,28 +317,12 @@
             <w:vAlign w:val="center"/>
           </w:tcPr>
           <w:p>
-            <w:pPr>
-              <w:spacing w:line="276" w:lineRule="auto" w:after="80" w:before="40"/>
-              <w:jc w:val="left"/>
-              <w:cnfStyle w:val="000000100000" w:firstRow="0" w:lastRow="0" w:firstColumn="0" w:lastColumn="0" w:oddVBand="0" w:evenVBand="0" w:oddHBand="1" w:evenHBand="0" w:firstRowFirstColumn="0" w:firstRowLastColumn="0" w:lastRowFirstColumn="0" w:lastRowLastColumn="0"/>
-              <w:rPr>
-                <w:rFonts w:ascii="Book Antiqua" w:hAnsi="Book Antiqua"/>
-                <w:b/>
-                <w:sz w:val="24"/>
-                <w:szCs w:val="24"/>
-              </w:rPr>
-            </w:pPr>
-            <w:r/>
-            <w:r>
-              <w:rPr>
-                <w:rFonts w:ascii="Book Antiqua" w:hAnsi="Book Antiqua"/>
-                <w:sz w:val="20"/>
-              </w:rPr>
+            <w:r>
               <w:t>Município de Maricá/RJ — Laboratório de Informática Avançada (Lab 02), Universidade de Vassouras (Campus Maricá - FUSVE), em cooperação com o ecossistema de discentes locais e Polo de Inovação de Maricá / ICTIM.</w:t>
               <w:br/>
               <w:t>• Endereço: Av. Roberto Silveira, nº 437, Bairro Flamengo, Maricá/RJ — CEP: 24903-815.</w:t>
               <w:br/>
-              <w:t>• Contato no Local Parceiro: Prof. Me. Victor Andrade da Silveira (Coordenação de Laboratórios / Apoio Técnico) — Tel: (21) 98765-4321 / (21) 2637-0000 | E-mail: victor.silveira@univassouras.edu.br.</w:t>
+              <w:t>• Contato no Local Parceiro: Prof. Me. Victor Andrade da Silveira (Coordenação de Laboratórios / Apoio Técnico) — Tel: (21) 2637-0000 | E-mail: victor.silveira@univassouras.edu.br.</w:t>
               <w:br/>
               <w:t>• Data e Horário da Ação Presencial: 17 de Outubro de 2026 (Sábado), das 09h00 às 11h30 (Oficina prática presencial com coleta de lista de presença física assinada e avaliação Likert).</w:t>
               <w:br/>
@@ -356,23 +340,16 @@
             <w:vAlign w:val="top"/>
           </w:tcPr>
           <w:p>
-            <w:pPr>
-              <w:spacing w:line="276" w:lineRule="auto" w:before="60" w:after="60"/>
-              <w:jc w:val="left"/>
-            </w:pPr>
-            <w:r/>
-            <w:r>
-              <w:rPr>
-                <w:rFonts w:ascii="Book Antiqua" w:hAnsi="Book Antiqua"/>
-                <w:sz w:val="20"/>
-              </w:rPr>
-              <w:t>A ação extensionista intervém diretamente na realidade territorial do município de Maricá/RJ (população estimada em ~197 mil habitantes segundo o Censo IBGE), articulando a comunidade acadêmica da Universidade de Vassouras (Campus Maricá - FUSVE) com o ecossistema municipal de estudantes da rede técnica (IFF Maricá, Faetec e escolas profissionalizantes), jovens programadores autônomos, microempreendedores locais e iniciativas de tecnologia estimuladas pelas políticas de desenvolvimento da cidade (como o ICTIM — Instituto de Ciência, Tecnologia e Inovação de Maricá e o circuito da Moeda Social Mumbuca).</w:t>
-              <w:br/>
-              <w:br/>
-              <w:t>O diagnóstico territorial evidenciou uma profunda lacuna de capacitação prática em métodos de engenharia de software e severa escassez de ferramentas acessíveis. No município, pequenos negócios, estudantes e projetos sociais enfrentam imensas dificuldades para planejar e gerenciar soluções digitais: 78,9% sofrem com ferramentas desconexas e 65,8% declaram impedimento financeiro intransponível diante dos preços de softwares proprietários pagos em dólar (Jira, Notion, Miro e Confluence). Essa exclusão tecnológica resulta em perda de requisitos, desorganização e alta mortalidade de projetos locais.</w:t>
-              <w:br/>
-              <w:br/>
-              <w:t>A intervenção extensionista atua diretamente nessa demanda através de duas frentes concretas: 1) uma oficina presencial de capacitação técnica 'Mão na Massa' no Laboratório do Campus Maricá; e 2) a entrega da plataforma unificada SpecLine com custo operacional zero (R$ 0,00), transferindo padrões de nível industrial para a comunidade maricaense.</w:t>
+            <w:r>
+              <w:rPr>
+                <w:b/>
+              </w:rPr>
+            </w:r>
+            <w:r>
+              <w:rPr>
+                <w:b/>
+              </w:rPr>
+              <w:t>Diagnóstico e justificativa da intervenção</w:t>
             </w:r>
           </w:p>
         </w:tc>
@@ -938,13 +915,7 @@
               </w:rPr>
             </w:pPr>
             <w:r>
-              <w:rPr>
-                <w:rFonts w:ascii="Book Antiqua" w:hAnsi="Book Antiqua"/>
-                <w:b w:val="0"/>
-                <w:i w:val="0"/>
-                <w:sz w:val="22"/>
-              </w:rPr>
-              <w:t>1. Desenvolver e implantar a plataforma web SpecLine baseada em Ruby on Rails 8 Solid Stack e PostgreSQL serverless, garantindo desempenho instantâneo e sustentabilidade com custo zero de infraestrutura na nuvem.</w:t>
+              <w:t>1. Desenvolver e implantar a plataforma web SpecLine baseada em Ruby on Rails 8 Solid Stack e PostgreSQL serverless, garantindo desempenho instantâneo e sustentabilidade com custo zero de infraestrutura na nuvem. Desse modo, estudantes, pequenos negócios e projetos sociais de Maricá passam a utilizar gratuitamente uma ferramenta profissional de gestão, sem barreira financeira, sem instalação e sem dependência de softwares proprietários cobrados em dólar.</w:t>
             </w:r>
           </w:p>
           <w:p>
@@ -953,13 +924,7 @@
               <w:jc w:val="both"/>
             </w:pPr>
             <w:r>
-              <w:rPr>
-                <w:rFonts w:ascii="Book Antiqua" w:hAnsi="Book Antiqua"/>
-                <w:b w:val="0"/>
-                <w:i w:val="0"/>
-                <w:sz w:val="22"/>
-              </w:rPr>
-              <w:t>2. Implementar os módulos de documentação rica (editor TipTap com comandos de barra), ideação com diagramas vivos (Mermaid.js) e quadro Kanban reativo (Hotwire/Stimulus).</w:t>
+              <w:t>2. Implementar os módulos de documentação rica (editor TipTap com comandos de barra), ideação com diagramas vivos (Mermaid.js) e quadro Kanban reativo (Hotwire/Stimulus). Com isso, participantes sem formação prévia em engenharia de software conseguem documentar ideias, organizar tarefas e visualizar projetos de forma guiada durante a oficina, levando o método para seus estudos, negócios e ações comunitárias.</w:t>
             </w:r>
           </w:p>
           <w:p>
@@ -2470,123 +2435,19 @@
             <w:vAlign w:val="top"/>
           </w:tcPr>
           <w:p>
-            <w:pPr>
-              <w:spacing w:line="276" w:lineRule="auto" w:after="80" w:before="40"/>
-              <w:jc w:val="both"/>
-              <w:cnfStyle w:val="000000000000" w:firstRow="0" w:lastRow="0" w:firstColumn="0" w:lastColumn="0" w:oddVBand="0" w:evenVBand="0" w:oddHBand="0" w:evenHBand="0" w:firstRowFirstColumn="0" w:firstRowLastColumn="0" w:lastRowFirstColumn="0" w:lastRowLastColumn="0"/>
-              <w:rPr>
-                <w:rFonts w:ascii="Book Antiqua" w:hAnsi="Book Antiqua"/>
-                <w:b/>
-                <w:sz w:val="24"/>
-                <w:szCs w:val="24"/>
-              </w:rPr>
-            </w:pPr>
-            <w:r>
-              <w:rPr>
-                <w:rFonts w:ascii="Book Antiqua" w:hAnsi="Book Antiqua"/>
-                <w:b w:val="0"/>
-                <w:i w:val="0"/>
-                <w:sz w:val="21"/>
-              </w:rPr>
+            <w:r>
               <w:t>• Mínimo de 15 a 30 participantes capacitados diretamente na ação extensionista presencial em Maricá;</w:t>
-            </w:r>
-          </w:p>
-          <w:p>
-            <w:pPr>
-              <w:spacing w:line="276" w:lineRule="auto" w:before="40" w:after="80"/>
-              <w:jc w:val="both"/>
-            </w:pPr>
-            <w:r>
-              <w:rPr>
-                <w:rFonts w:ascii="Book Antiqua" w:hAnsi="Book Antiqua"/>
-                <w:b w:val="0"/>
-                <w:i w:val="0"/>
-                <w:sz w:val="21"/>
-              </w:rPr>
+              <w:br/>
               <w:t>• 100% de preenchimento e recolhimento da Lista de Presença com assinaturas comprobatórias;</w:t>
-            </w:r>
-          </w:p>
-          <w:p>
-            <w:pPr>
-              <w:spacing w:line="276" w:lineRule="auto" w:before="40" w:after="80"/>
-              <w:jc w:val="both"/>
-            </w:pPr>
-            <w:r>
-              <w:rPr>
-                <w:rFonts w:ascii="Book Antiqua" w:hAnsi="Book Antiqua"/>
-                <w:b w:val="0"/>
-                <w:i w:val="0"/>
-                <w:sz w:val="21"/>
-              </w:rPr>
-              <w:t>• Mínimo de 8 a 15 registros fotográficos datados registrando a interação, a mentoria e o uso da plataforma em campo;</w:t>
-            </w:r>
-          </w:p>
-          <w:p>
-            <w:pPr>
-              <w:spacing w:line="276" w:lineRule="auto" w:before="40" w:after="80"/>
-              <w:jc w:val="both"/>
-            </w:pPr>
-            <w:r>
-              <w:rPr>
-                <w:rFonts w:ascii="Book Antiqua" w:hAnsi="Book Antiqua"/>
-                <w:b w:val="0"/>
-                <w:i w:val="0"/>
-                <w:sz w:val="21"/>
-              </w:rPr>
+              <w:br/>
+              <w:t>• Mínimo de 5 a 10 registros fotográficos datados registrando a interação, a mentoria e o uso da plataforma em campo;</w:t>
+              <w:br/>
               <w:t>• 100% dos participantes da oficina respondendo ao instrumento de avaliação de impacto;</w:t>
-            </w:r>
-          </w:p>
-          <w:p>
-            <w:pPr>
-              <w:spacing w:line="276" w:lineRule="auto" w:before="40" w:after="80"/>
-              <w:jc w:val="both"/>
-            </w:pPr>
-            <w:r>
-              <w:rPr>
-                <w:rFonts w:ascii="Book Antiqua" w:hAnsi="Book Antiqua"/>
-                <w:b/>
-                <w:i w:val="0"/>
-                <w:sz w:val="21"/>
-              </w:rPr>
-              <w:t>• 1 plataforma web no ar em produção (https:</w:t>
-            </w:r>
-            <w:r>
-              <w:rPr>
-                <w:rFonts w:ascii="Book Antiqua" w:hAnsi="Book Antiqua"/>
-                <w:b w:val="0"/>
-                <w:i w:val="0"/>
-                <w:sz w:val="21"/>
-              </w:rPr>
-              <w:t>//specline.onrender.com) com custo zero e disponibilidade integral;</w:t>
-            </w:r>
-          </w:p>
-          <w:p>
-            <w:pPr>
-              <w:spacing w:line="276" w:lineRule="auto" w:before="40" w:after="80"/>
-              <w:jc w:val="both"/>
-            </w:pPr>
-            <w:r>
-              <w:rPr>
-                <w:rFonts w:ascii="Book Antiqua" w:hAnsi="Book Antiqua"/>
-                <w:b w:val="0"/>
-                <w:i w:val="0"/>
-                <w:sz w:val="21"/>
-              </w:rPr>
+              <w:br/>
+              <w:t>• 1 plataforma web no ar em produção (https://specline.onrender.com) com custo zero e disponibilidade integral;</w:t>
+              <w:br/>
               <w:t>• 50 testes automatizados com 100% de sucesso mantendo a robustez técnica do produto;</w:t>
-            </w:r>
-          </w:p>
-          <w:p>
-            <w:pPr>
-              <w:spacing w:line="276" w:lineRule="auto" w:before="40" w:after="80"/>
-              <w:jc w:val="both"/>
-            </w:pPr>
-            <w:r>
-              <w:rPr>
-                <w:rFonts w:ascii="Book Antiqua" w:hAnsi="Book Antiqua"/>
-                <w:b w:val="0"/>
-                <w:i w:val="0"/>
-                <w:sz w:val="21"/>
-              </w:rPr>
+              <w:br/>
               <w:t>• Apresentação oficial e homologação do projeto na Mostra de Extensão da faculdade.</w:t>
             </w:r>
           </w:p>

</xml_diff>